<commit_message>
Release SearchFix Phase 2.1
</commit_message>
<xml_diff>
--- a/SearchFix_Software_Documentation.docx
+++ b/SearchFix_Software_Documentation.docx
@@ -27,7 +27,7 @@
           <w:color w:val="64748B"/>
           <w:sz w:val="26"/>
         </w:rPr>
-        <w:t>Phase 2 — Comment Understanding, PDF Document Analysis &amp; Evidence-Based Decision System</w:t>
+        <w:t>Interactive 2-Step Extension Architecture (Comment Analysis ➔ Document Selection ➔ PDF Upload ➔ Decision)</w:t>
       </w:r>
     </w:p>
     <w:p>
@@ -129,7 +129,7 @@
                 <w:color w:val="1E293B"/>
                 <w:sz w:val="20"/>
               </w:rPr>
-              <w:t>Decision States</w:t>
+              <w:t>Decision Output States</w:t>
             </w:r>
           </w:p>
         </w:tc>
@@ -145,7 +145,7 @@
                 <w:color w:val="334155"/>
                 <w:sz w:val="20"/>
               </w:rPr>
-              <w:t>ACCEPTED / DISPUTED / REVIEW_REQUIRED (Configurable)</w:t>
+              <w:t>ACCEPTED (Company Error) / DISPUTED (Files Correct) / REVIEW_REQUIRED</w:t>
             </w:r>
           </w:p>
         </w:tc>
@@ -164,7 +164,7 @@
                 <w:color w:val="1E293B"/>
                 <w:sz w:val="20"/>
               </w:rPr>
-              <w:t>Phase 2 Endpoint</w:t>
+              <w:t>Step 1 Endpoint</w:t>
             </w:r>
           </w:p>
         </w:tc>
@@ -180,7 +180,7 @@
                 <w:color w:val="334155"/>
                 <w:sz w:val="20"/>
               </w:rPr>
-              <w:t>POST http://localhost:3000/api/searchfix/analyze (multipart/form-data)</w:t>
+              <w:t>POST http://localhost:3000/api/searchfix/analyze-comments (application/json)</w:t>
             </w:r>
           </w:p>
         </w:tc>
@@ -199,7 +199,7 @@
                 <w:color w:val="1E293B"/>
                 <w:sz w:val="20"/>
               </w:rPr>
-              <w:t>Phase 1 Endpoint</w:t>
+              <w:t>Step 2 Endpoint</w:t>
             </w:r>
           </w:p>
         </w:tc>
@@ -215,7 +215,7 @@
                 <w:color w:val="334155"/>
                 <w:sz w:val="20"/>
               </w:rPr>
-              <w:t>POST http://localhost:3000/api/searchfix/analyze-comments (application/json)</w:t>
+              <w:t>POST http://localhost:3000/api/searchfix/analyze-documents (multipart/form-data)</w:t>
             </w:r>
           </w:p>
         </w:tc>
@@ -273,7 +273,7 @@
           <w:color w:val="0F172A"/>
           <w:sz w:val="32"/>
         </w:rPr>
-        <w:t>1. Application Architecture &amp; 7-Stage Pipeline</w:t>
+        <w:t>1. Interactive 2-Step Architecture &amp; Workflow</w:t>
       </w:r>
     </w:p>
     <w:p>
@@ -286,7 +286,7 @@
           <w:color w:val="334155"/>
           <w:sz w:val="21"/>
         </w:rPr>
-        <w:t>Phase 2 implements a 7-stage modular pipeline: Request Parsing ➔ Comment Timeline Selection ➔ Issue Classification ➔ Document Selection ➔ Target PDF Document Analysis ➔ Evidence Extraction ➔ Claim vs Evidence Decision Engine.</w:t>
+        <w:t>Step 1 receives comments and returns required file types so the Chrome Extension downloads ONLY requested files. Step 2 receives uploaded PDFs and evaluates ACCEPTED / DISPUTED / REVIEW_REQUIRED decisions.</w:t>
       </w:r>
     </w:p>
     <w:p>
@@ -341,7 +341,7 @@
           <w:color w:val="0F172A"/>
           <w:sz w:val="32"/>
         </w:rPr>
-        <w:t>2. Decision Engine Logic (ACCEPTED / DISPUTED / REVIEW_REQUIRED)</w:t>
+        <w:t>2. Decision Engine Output States</w:t>
       </w:r>
     </w:p>
     <w:p>
@@ -354,7 +354,7 @@
           <w:color w:val="334155"/>
           <w:sz w:val="21"/>
         </w:rPr>
-        <w:t>The system evaluates evidence against client claims. ACCEPTED is returned when company error is confirmed. DISPUTED is returned when evidence contradicts the claim. REVIEW_REQUIRED is returned when required supporting documents were not provided or evidence is inconclusive.</w:t>
+        <w:t>ACCEPTED confirms company error. DISPUTED confirms company files are correct. REVIEW_REQUIRED is returned when required supporting documents were not provided or evidence is inconclusive.</w:t>
       </w:r>
     </w:p>
     <w:p>
@@ -409,7 +409,7 @@
           <w:color w:val="0F172A"/>
           <w:sz w:val="32"/>
         </w:rPr>
-        <w:t>3. User Interaction &amp; Sequence Map</w:t>
+        <w:t>3. Interactive 2-Step Sequence Map</w:t>
       </w:r>
     </w:p>
     <w:p>
@@ -422,7 +422,7 @@
           <w:color w:val="334155"/>
           <w:sz w:val="21"/>
         </w:rPr>
-        <w:t>Sequence map detailing communication between User/Extension, Express Controller, Comment Selector, Document Analyzer, and Gemini Files API.</w:t>
+        <w:t>Sequence diagram detailing the 2-step interaction between Chrome Extension, Express Controller, Comment &amp; Routing Engine, Document Analyzer, and Gemini Files API.</w:t>
       </w:r>
     </w:p>
     <w:p>
@@ -477,7 +477,7 @@
           <w:color w:val="0F172A"/>
           <w:sz w:val="32"/>
         </w:rPr>
-        <w:t>4. Technology &amp; Component Matrix</w:t>
+        <w:t>4. Technology Matrix &amp; Endpoint Mapping</w:t>
       </w:r>
     </w:p>
     <w:p>
@@ -490,7 +490,7 @@
           <w:color w:val="334155"/>
           <w:sz w:val="21"/>
         </w:rPr>
-        <w:t>Breakdown of Node.js, Express, Multer file upload, Zod schema engine, @google/genai SDK, and category whitelist guards.</w:t>
+        <w:t>Breakdown of Node.js, Express, Multer file upload, Zod schema engine, @google/genai SDK, and endpoints.</w:t>
       </w:r>
     </w:p>
     <w:p>
@@ -558,7 +558,7 @@
           <w:color w:val="334155"/>
           <w:sz w:val="21"/>
         </w:rPr>
-        <w:t>Overview of API routes (Phase 1 &amp; Phase 2), test suites (Orders 1-8 regression dataset), and cloud hosting on Render.com.</w:t>
+        <w:t>Overview of interactive API routes, test suites (Orders 1-8 regression dataset), and cloud hosting on Render.com.</w:t>
       </w:r>
     </w:p>
     <w:p>

</xml_diff>